<commit_message>
Stsrted to add Choreo
</commit_message>
<xml_diff>
--- a/Choreo for Romi.docx
+++ b/Choreo for Romi.docx
@@ -402,6 +402,37 @@
       <w:pPr>
         <w:pStyle w:val="Normal"/>
         <w:bidi w:val="0"/>
+        <w:spacing w:before="0" w:after="0"/>
+        <w:ind w:hanging="0" w:left="0" w:right="0"/>
+        <w:rPr>
+          <w:rFonts w:ascii="Google Sans;Roboto;Arial;sans-serif" w:hAnsi="Google Sans;Roboto;Arial;sans-serif"/>
+          <w:b w:val="false"/>
+          <w:strike w:val="false"/>
+          <w:dstrike w:val="false"/>
+          <w:color w:val="FF0000"/>
+          <w:sz w:val="24"/>
+          <w:u w:val="none"/>
+          <w:effect w:val="none"/>
+        </w:rPr>
+      </w:pPr>
+      <w:r>
+        <w:rPr>
+          <w:rFonts w:ascii="Google Sans;Roboto;Arial;sans-serif" w:hAnsi="Google Sans;Roboto;Arial;sans-serif"/>
+          <w:b w:val="false"/>
+          <w:strike w:val="false"/>
+          <w:dstrike w:val="false"/>
+          <w:color w:val="FF0000"/>
+          <w:sz w:val="24"/>
+          <w:u w:val="none"/>
+          <w:effect w:val="none"/>
+        </w:rPr>
+        <w:t xml:space="preserve">https://choreo.autos/lib/ChoreoLib2026.json </w:t>
+      </w:r>
+    </w:p>
+    <w:p>
+      <w:pPr>
+        <w:pStyle w:val="Normal"/>
+        <w:bidi w:val="0"/>
         <w:spacing w:before="360" w:after="180"/>
         <w:ind w:hanging="0" w:left="0" w:right="0"/>
         <w:rPr>
@@ -508,7 +539,37 @@
           <w:effect w:val="none"/>
         </w:rPr>
       </w:pPr>
-      <w:r>
+      <w:hyperlink r:id="rId10">
+        <w:r>
+          <w:rPr>
+            <w:rStyle w:val="Hyperlink"/>
+            <w:rFonts w:ascii="Google Sans;Roboto;Arial;sans-serif" w:hAnsi="Google Sans;Roboto;Arial;sans-serif"/>
+            <w:b w:val="false"/>
+            <w:strike w:val="false"/>
+            <w:dstrike w:val="false"/>
+            <w:color w:val="FF0000"/>
+            <w:sz w:val="24"/>
+            <w:u w:val="none"/>
+            <w:effect w:val="none"/>
+          </w:rPr>
+          <w:t>https://docs.wpilib.org/en/stable/docs/software/pathplanning/choreo/index.html</w:t>
+        </w:r>
+      </w:hyperlink>
+    </w:p>
+    <w:p>
+      <w:pPr>
+        <w:pStyle w:val="BodyText"/>
+        <w:numPr>
+          <w:ilvl w:val="0"/>
+          <w:numId w:val="0"/>
+        </w:numPr>
+        <w:tabs>
+          <w:tab w:val="clear" w:pos="709"/>
+          <w:tab w:val="left" w:pos="0" w:leader="none"/>
+        </w:tabs>
+        <w:bidi w:val="0"/>
+        <w:spacing w:before="0" w:after="0"/>
+        <w:ind w:hanging="0" w:left="0" w:right="0"/>
         <w:rPr>
           <w:rFonts w:ascii="Google Sans;Roboto;Arial;sans-serif" w:hAnsi="Google Sans;Roboto;Arial;sans-serif"/>
           <w:b w:val="false"/>
@@ -519,7 +580,18 @@
           <w:u w:val="none"/>
           <w:effect w:val="none"/>
         </w:rPr>
-        <w:t>https://docs.wpilib.org/en/stable/docs/software/pathplanning/choreo/index.html</w:t>
+      </w:pPr>
+      <w:r>
+        <w:rPr>
+          <w:rFonts w:ascii="Google Sans;Roboto;Arial;sans-serif" w:hAnsi="Google Sans;Roboto;Arial;sans-serif"/>
+          <w:b w:val="false"/>
+          <w:strike w:val="false"/>
+          <w:dstrike w:val="false"/>
+          <w:color w:val="FF0000"/>
+          <w:sz w:val="24"/>
+          <w:u w:val="none"/>
+          <w:effect w:val="none"/>
+        </w:rPr>
       </w:r>
     </w:p>
     <w:p>
@@ -604,7 +676,7 @@
         </w:rPr>
         <w:t>Input your Romi's physical constraints (track width, max velocity, and max acceleration) into the profile settings. [</w:t>
       </w:r>
-      <w:hyperlink r:id="rId10">
+      <w:hyperlink r:id="rId11">
         <w:r>
           <w:rPr>
             <w:rStyle w:val="Hyperlink"/>
@@ -631,7 +703,7 @@
         </w:rPr>
         <w:t xml:space="preserve">, </w:t>
       </w:r>
-      <w:hyperlink r:id="rId11">
+      <w:hyperlink r:id="rId12">
         <w:r>
           <w:rPr>
             <w:rStyle w:val="Hyperlink"/>
@@ -658,7 +730,7 @@
         </w:rPr>
         <w:t xml:space="preserve">, </w:t>
       </w:r>
-      <w:hyperlink r:id="rId12">
+      <w:hyperlink r:id="rId13">
         <w:r>
           <w:rPr>
             <w:rStyle w:val="Hyperlink"/>
@@ -835,7 +907,7 @@
         </w:rPr>
         <w:t>Ensure your Romi project is set up using the standard WPILib VS Code extension. [</w:t>
       </w:r>
-      <w:hyperlink r:id="rId13">
+      <w:hyperlink r:id="rId14">
         <w:r>
           <w:rPr>
             <w:rStyle w:val="Hyperlink"/>
@@ -862,7 +934,7 @@
         </w:rPr>
         <w:t xml:space="preserve">, </w:t>
       </w:r>
-      <w:hyperlink r:id="rId14">
+      <w:hyperlink r:id="rId15">
         <w:r>
           <w:rPr>
             <w:rStyle w:val="Hyperlink"/>
@@ -889,7 +961,7 @@
         </w:rPr>
         <w:t xml:space="preserve">, </w:t>
       </w:r>
-      <w:hyperlink r:id="rId15">
+      <w:hyperlink r:id="rId16">
         <w:r>
           <w:rPr>
             <w:rStyle w:val="Hyperlink"/>
@@ -916,7 +988,7 @@
         </w:rPr>
         <w:t xml:space="preserve">, </w:t>
       </w:r>
-      <w:hyperlink r:id="rId16">
+      <w:hyperlink r:id="rId17">
         <w:r>
           <w:rPr>
             <w:rStyle w:val="Hyperlink"/>
@@ -943,7 +1015,7 @@
         </w:rPr>
         <w:t xml:space="preserve">, </w:t>
       </w:r>
-      <w:hyperlink r:id="rId17">
+      <w:hyperlink r:id="rId18">
         <w:r>
           <w:rPr>
             <w:rStyle w:val="Hyperlink"/>
@@ -1215,7 +1287,7 @@
         </w:rPr>
         <w:t>) to watch your desktop code drive the physical Romi through your Choreo-optimized path. [</w:t>
       </w:r>
-      <w:hyperlink r:id="rId18">
+      <w:hyperlink r:id="rId19">
         <w:r>
           <w:rPr>
             <w:rStyle w:val="Hyperlink"/>
@@ -1242,7 +1314,7 @@
         </w:rPr>
         <w:t xml:space="preserve">, </w:t>
       </w:r>
-      <w:hyperlink r:id="rId19">
+      <w:hyperlink r:id="rId20">
         <w:r>
           <w:rPr>
             <w:rStyle w:val="Hyperlink"/>
@@ -1269,7 +1341,7 @@
         </w:rPr>
         <w:t xml:space="preserve">, </w:t>
       </w:r>
-      <w:hyperlink r:id="rId20">
+      <w:hyperlink r:id="rId21">
         <w:r>
           <w:rPr>
             <w:rStyle w:val="Hyperlink"/>
@@ -1296,7 +1368,7 @@
         </w:rPr>
         <w:t xml:space="preserve">, </w:t>
       </w:r>
-      <w:hyperlink r:id="rId21">
+      <w:hyperlink r:id="rId22">
         <w:r>
           <w:rPr>
             <w:rStyle w:val="Hyperlink"/>
@@ -1323,7 +1395,7 @@
         </w:rPr>
         <w:t xml:space="preserve">, </w:t>
       </w:r>
-      <w:hyperlink r:id="rId22">
+      <w:hyperlink r:id="rId23">
         <w:r>
           <w:rPr>
             <w:rStyle w:val="Hyperlink"/>
@@ -1425,7 +1497,7 @@
                     </pic:cNvPicPr>
                   </pic:nvPicPr>
                   <pic:blipFill>
-                    <a:blip r:embed="rId23"/>
+                    <a:blip r:embed="rId24"/>
                     <a:stretch>
                       <a:fillRect/>
                     </a:stretch>
@@ -1606,7 +1678,7 @@
                     </pic:cNvPicPr>
                   </pic:nvPicPr>
                   <pic:blipFill>
-                    <a:blip r:embed="rId24"/>
+                    <a:blip r:embed="rId25"/>
                     <a:stretch>
                       <a:fillRect/>
                     </a:stretch>
@@ -2341,8 +2413,8 @@
       <w:u w:val="single"/>
     </w:rPr>
   </w:style>
-  <w:style w:type="character" w:styleId="Bulletsuser">
-    <w:name w:val="Bullets (user)"/>
+  <w:style w:type="character" w:styleId="Bullets">
+    <w:name w:val="Bullets"/>
     <w:qFormat/>
     <w:rPr>
       <w:rFonts w:ascii="OpenSymbol" w:hAnsi="OpenSymbol" w:eastAsia="OpenSymbol" w:cs="OpenSymbol"/>

</xml_diff>